<commit_message>
added web template reference
</commit_message>
<xml_diff>
--- a/products/braze-proxy/custom-client-braze-proxy-setup-guide.docx
+++ b/products/braze-proxy/custom-client-braze-proxy-setup-guide.docx
@@ -648,8 +648,138 @@
         <w:rPr>
           <w:color w:val="auto"/>
         </w:rPr>
-        <w:t>To actively route your frontend tracking traffic completely through your server-side container infrastructure, apply the following two code alterations to your codebase:</w:t>
+        <w:t xml:space="preserve">To actively route your frontend tracking traffic completely through your server-side container infrastructure, </w:t>
       </w:r>
+      <w:r>
+        <w:rPr>
+          <w:color w:val="auto"/>
+        </w:rPr>
+        <w:t>see</w:t>
+      </w:r>
+      <w:r>
+        <w:rPr>
+          <w:color w:val="auto"/>
+        </w:rPr>
+        <w:t xml:space="preserve"> the two code alterations </w:t>
+      </w:r>
+      <w:r>
+        <w:rPr>
+          <w:color w:val="auto"/>
+        </w:rPr>
+        <w:t>below.</w:t>
+      </w:r>
+    </w:p>
+    <w:tbl>
+      <w:tblPr>
+        <w:tblW w:w="0" w:type="auto"/>
+        <w:tblBorders>
+          <w:left w:val="single" w:sz="24" w:space="0" w:color="auto"/>
+        </w:tblBorders>
+        <w:tblLayout w:type="fixed"/>
+        <w:tblLook w:val="04A0" w:firstRow="1" w:lastRow="0" w:firstColumn="1" w:lastColumn="0" w:noHBand="0" w:noVBand="1"/>
+      </w:tblPr>
+      <w:tblGrid>
+        <w:gridCol w:w="9360"/>
+      </w:tblGrid>
+      <w:tr>
+        <w:tc>
+          <w:tcPr>
+            <w:tcW w:w="9360" w:type="dxa"/>
+            <w:shd w:val="clear" w:color="auto" w:fill="F2F2F2" w:themeFill="background1" w:themeFillShade="F2"/>
+            <w:tcMar>
+              <w:top w:w="140" w:type="dxa"/>
+              <w:left w:w="200" w:type="dxa"/>
+              <w:bottom w:w="140" w:type="dxa"/>
+              <w:right w:w="200" w:type="dxa"/>
+            </w:tcMar>
+          </w:tcPr>
+          <w:p>
+            <w:pPr>
+              <w:rPr>
+                <w:color w:val="auto"/>
+              </w:rPr>
+            </w:pPr>
+            <w:r>
+              <w:rPr>
+                <w:rFonts w:ascii="Segoe UI Emoji" w:hAnsi="Segoe UI Emoji" w:cs="Segoe UI Emoji"/>
+                <w:color w:val="auto"/>
+              </w:rPr>
+              <w:t>💡</w:t>
+            </w:r>
+            <w:r>
+              <w:rPr>
+                <w:color w:val="auto"/>
+              </w:rPr>
+              <w:t xml:space="preserve"> Instead of adding the code snippets </w:t>
+            </w:r>
+            <w:r>
+              <w:rPr>
+                <w:color w:val="auto"/>
+              </w:rPr>
+              <w:t>below</w:t>
+            </w:r>
+            <w:r>
+              <w:rPr>
+                <w:color w:val="auto"/>
+              </w:rPr>
+              <w:t xml:space="preserve"> manually, you can use the free companion </w:t>
+            </w:r>
+            <w:hyperlink r:id="rId11" w:tgtFrame="_blank" w:history="1">
+              <w:r>
+                <w:rPr>
+                  <w:rStyle w:val="Hyperlink"/>
+                </w:rPr>
+                <w:t xml:space="preserve">Braze </w:t>
+              </w:r>
+              <w:proofErr w:type="gramStart"/>
+              <w:r>
+                <w:rPr>
+                  <w:rStyle w:val="Hyperlink"/>
+                </w:rPr>
+                <w:t>Initialization Tag</w:t>
+              </w:r>
+              <w:proofErr w:type="gramEnd"/>
+              <w:r>
+                <w:rPr>
+                  <w:rStyle w:val="Hyperlink"/>
+                </w:rPr>
+                <w:t xml:space="preserve"> (First-Party Do</w:t>
+              </w:r>
+              <w:r>
+                <w:rPr>
+                  <w:rStyle w:val="Hyperlink"/>
+                </w:rPr>
+                <w:t>m</w:t>
+              </w:r>
+              <w:r>
+                <w:rPr>
+                  <w:rStyle w:val="Hyperlink"/>
+                </w:rPr>
+                <w:t>ain)</w:t>
+              </w:r>
+            </w:hyperlink>
+            <w:r>
+              <w:rPr>
+                <w:color w:val="auto"/>
+              </w:rPr>
+              <w:t xml:space="preserve"> </w:t>
+            </w:r>
+            <w:r>
+              <w:rPr>
+                <w:color w:val="auto"/>
+              </w:rPr>
+              <w:t>tag available in the Google Tag Manager Community Template Gallery. Just search for “Braze Initialization Tag with First-Party Domain”.</w:t>
+            </w:r>
+          </w:p>
+        </w:tc>
+      </w:tr>
+    </w:tbl>
+    <w:p>
+      <w:pPr>
+        <w:rPr>
+          <w:color w:val="auto"/>
+        </w:rPr>
+      </w:pPr>
     </w:p>
     <w:p>
       <w:pPr>
@@ -704,7 +834,7 @@
         </w:rPr>
         <w:t xml:space="preserve">Follow the documentation on how to install the Braze library via Braze CDN as described here: </w:t>
       </w:r>
-      <w:hyperlink r:id="rId11" w:history="1">
+      <w:hyperlink r:id="rId12" w:history="1">
         <w:r>
           <w:rPr>
             <w:rStyle w:val="Hyperlink"/>
@@ -789,6 +919,7 @@
                 <w:color w:val="auto"/>
                 <w:sz w:val="19"/>
               </w:rPr>
+              <w:lastRenderedPageBreak/>
               <w:t>&lt;script type="text/</w:t>
             </w:r>
             <w:proofErr w:type="spellStart"/>
@@ -1220,7 +1351,6 @@
           <w:color w:val="auto"/>
           <w:sz w:val="24"/>
         </w:rPr>
-        <w:lastRenderedPageBreak/>
         <w:t>2</w:t>
       </w:r>
       <w:r>
@@ -1504,8 +1634,8 @@
       </w:pPr>
     </w:p>
     <w:sectPr>
-      <w:headerReference w:type="default" r:id="rId12"/>
-      <w:footerReference w:type="default" r:id="rId13"/>
+      <w:headerReference w:type="default" r:id="rId13"/>
+      <w:footerReference w:type="default" r:id="rId14"/>
       <w:pgSz w:w="12240" w:h="15840"/>
       <w:pgMar w:top="1440" w:right="1440" w:bottom="1440" w:left="1440" w:header="720" w:footer="720" w:gutter="0"/>
       <w:cols w:space="720"/>
@@ -2829,7 +2959,6 @@
   <w:style w:type="character" w:default="1" w:styleId="Absatz-Standardschriftart">
     <w:name w:val="Default Paragraph Font"/>
     <w:uiPriority w:val="1"/>
-    <w:semiHidden/>
     <w:unhideWhenUsed/>
   </w:style>
   <w:style w:type="table" w:default="1" w:styleId="NormaleTabelle">
@@ -13627,6 +13756,18 @@
     <w:rPr>
       <w:color w:val="605E5C"/>
       <w:shd w:val="clear" w:color="auto" w:fill="E1DFDD"/>
+    </w:rPr>
+  </w:style>
+  <w:style w:type="character" w:styleId="BesuchterLink">
+    <w:name w:val="FollowedHyperlink"/>
+    <w:basedOn w:val="Absatz-Standardschriftart"/>
+    <w:uiPriority w:val="99"/>
+    <w:semiHidden/>
+    <w:unhideWhenUsed/>
+    <w:rsid w:val="00BD26A6"/>
+    <w:rPr>
+      <w:color w:val="800080" w:themeColor="followedHyperlink"/>
+      <w:u w:val="single"/>
     </w:rPr>
   </w:style>
 </w:styles>

</xml_diff>